<commit_message>
test(format-docx): pin pgSz into w14_paraid_word.docx after main sync (#109)
main gained three more fixtures (image_wrap_modes.docx,
table_cell_runs.docx, w14_paraid_word.docx) while this branch was in
flight. Of the three, only w14_paraid_word.docx is safe to pin: its
step-12 assertion (run_ui_save_root_bindings) compares two fresh
resaves of the same edited tree against EACH OTHER, so the writer's
stock-A4 sectPr compaction lands on both sides identically.

image_wrap_modes.docx and table_cell_runs.docx join
grab_bag_exotic.docx / floating_image_anchor.docx /
footnotes_endnotes.docx in the documented exclusion list: their
default-harness assertions compare a resave against the pinned SOURCE
text by exact string equality, which the compaction would desync.

cargo run -p roundtrip --release (default, now steps through 14c) and
-- --fixtures (23 fixtures) both PASS.

Co-Authored-By: Claude Sonnet 5 <noreply@anthropic.com>
</commit_message>
<xml_diff>
--- a/crates/format-docx/tests/fixtures/w14_paraid_word.docx
+++ b/crates/format-docx/tests/fixtures/w14_paraid_word.docx
@@ -42,7 +42,10 @@
         <w:t xml:space="preserve">after</w:t>
       </w:r>
     </w:p>
-    <w:sectPr/>
+    <w:sectPr>
+      <w:pgSz w:w="11906" w:h="16838"/>
+      <w:pgMar w:top="1440" w:right="1440" w:bottom="1440" w:left="1440" w:header="720" w:footer="720"/>
+    </w:sectPr>
   </w:body>
 </w:document>
 </file>
</xml_diff>